<commit_message>
Update Module 2 (Exps 08-13) with real-world macroeconomic and commercial logistics datasets, executed notebooks, and lab documentation
</commit_message>
<xml_diff>
--- a/Module_2/Experiment_08_Simulated_Annealing/Documentation_Experiment_08.docx
+++ b/Module_2/Experiment_08_Simulated_Annealing/Documentation_Experiment_08.docx
@@ -56,7 +56,7 @@
           <w:b w:val="0"/>
           <w:sz w:val="22"/>
         </w:rPr>
-        <w:t xml:space="preserve"> Simulated Annealing for Function Optimization &amp; Economic Portfolio Allocation</w:t>
+        <w:t xml:space="preserve"> Simulated Annealing for Function Optimization &amp; Real Macroeconomic Asset Allocation</w:t>
       </w:r>
     </w:p>
     <w:p>
@@ -77,7 +77,7 @@
           <w:rFonts w:ascii="Times New Roman" w:hAnsi="Times New Roman"/>
           <w:sz w:val="22"/>
         </w:rPr>
-        <w:t>Implement Simulated Annealing from scratch to minimize non-convex multimodal functions and optimize economic capital allocation across financial assets under rebalancing transaction costs.</w:t>
+        <w:t>Implement Simulated Annealing from scratch to minimize non-convex functions and optimize capital allocation across real macroeconomic asset classes (USMacroG real dataset: Investment, Consumption, Government, M1, Treasury Bills) under rebalancing transaction costs.</w:t>
       </w:r>
     </w:p>
     <w:p>
@@ -98,9 +98,9 @@
           <w:rFonts w:ascii="Times New Roman" w:hAnsi="Times New Roman"/>
           <w:sz w:val="22"/>
         </w:rPr>
-        <w:t>1. Benchmark Optimization: Minimize non-convex multimodal function f(x) = x^2 + 10*sin(x) over [-10, 10].</w:t>
+        <w:t>1. Benchmark Optimization: Minimize multimodal function f(x) = x^2 + 10*sin(x) over [-10, 10].</w:t>
         <w:br/>
-        <w:t>2. Applied Economic Optimization: Markowitz modern portfolio theory subject to nonlinear transaction and liquidity friction: L(w) = w^T Sigma w - lambda (mu^T w) + gamma sum |w_i - w_i^(0)|^1.5 subject to sum w_i = 1, w_i &gt;= 0.</w:t>
+        <w:t>2. Real Economic Application: Real quarterly macroeconomic capital returns from USMacroG (203 real quarters). Objective: L(w) = w^T Sigma w - lambda (mu^T w) + gamma sum |w_i - w_i^(0)|^1.5 subject to sum w_i = 1, w_i &gt;= 0.</w:t>
       </w:r>
     </w:p>
     <w:p>
@@ -128,7 +128,7 @@
           <w:rFonts w:ascii="Times New Roman" w:hAnsi="Times New Roman"/>
           <w:sz w:val="22"/>
         </w:rPr>
-        <w:t>1. Initialize current asset weights w0 on the unit simplex and calculate initial objective cost.</w:t>
+        <w:t>1. Load real macroeconomic quarterly asset returns from USMacroG dataset and calculate empirical covariance matrix Sigma and mean vector mu.</w:t>
       </w:r>
     </w:p>
     <w:p>
@@ -141,7 +141,7 @@
           <w:rFonts w:ascii="Times New Roman" w:hAnsi="Times New Roman"/>
           <w:sz w:val="22"/>
         </w:rPr>
-        <w:t>2. Set initial temperature T0 and cooling rate alpha.</w:t>
+        <w:t>2. Initialize equal asset allocation weights w0 on the unit simplex and evaluate initial cost.</w:t>
       </w:r>
     </w:p>
     <w:p>
@@ -154,7 +154,7 @@
           <w:rFonts w:ascii="Times New Roman" w:hAnsi="Times New Roman"/>
           <w:sz w:val="22"/>
         </w:rPr>
-        <w:t>3. Generate a neighbor candidate solution by perturbing asset weights respecting simplex constraints sum(w)=1.</w:t>
+        <w:t>3. Set initial temperature T0 and cooling rate alpha.</w:t>
       </w:r>
     </w:p>
     <w:p>
@@ -167,7 +167,7 @@
           <w:rFonts w:ascii="Times New Roman" w:hAnsi="Times New Roman"/>
           <w:sz w:val="22"/>
         </w:rPr>
-        <w:t>4. Calculate change in objective cost delta_E = L(w_new) - L(w_current).</w:t>
+        <w:t>4. Generate a neighbor candidate solution on the simplex by perturbing weights between random assets.</w:t>
       </w:r>
     </w:p>
     <w:p>
@@ -180,7 +180,7 @@
           <w:rFonts w:ascii="Times New Roman" w:hAnsi="Times New Roman"/>
           <w:sz w:val="22"/>
         </w:rPr>
-        <w:t>5. Accept neighbor unconditionally if delta_E &lt; 0; otherwise accept probabilistically with Metropolis probability P = exp(-delta_E / T).</w:t>
+        <w:t>5. Calculate cost difference delta_E = L(w_new) - L(w_current).</w:t>
       </w:r>
     </w:p>
     <w:p>
@@ -193,7 +193,7 @@
           <w:rFonts w:ascii="Times New Roman" w:hAnsi="Times New Roman"/>
           <w:sz w:val="22"/>
         </w:rPr>
-        <w:t>6. Update global best solution if the new state achieves lower cost.</w:t>
+        <w:t>6. Accept downhill transitions unconditionally; accept uphill transitions probabilistically via Metropolis probability P = exp(-delta_E / T).</w:t>
       </w:r>
     </w:p>
     <w:p>
@@ -206,7 +206,7 @@
           <w:rFonts w:ascii="Times New Roman" w:hAnsi="Times New Roman"/>
           <w:sz w:val="22"/>
         </w:rPr>
-        <w:t>7. Decay system temperature according to geometric cooling schedule T = alpha * T.</w:t>
+        <w:t>7. Decay temperature geometrically: T = alpha * T.</w:t>
       </w:r>
     </w:p>
     <w:p>
@@ -219,7 +219,7 @@
           <w:rFonts w:ascii="Times New Roman" w:hAnsi="Times New Roman"/>
           <w:sz w:val="22"/>
         </w:rPr>
-        <w:t>8. Repeat for max_iter steps and return optimal asset allocation weights and minimum cost.</w:t>
+        <w:t>8. Repeat for max_iter steps and return optimal allocation weights and minimum cost.</w:t>
       </w:r>
     </w:p>
     <w:p>
@@ -372,7 +372,7 @@
                 <w:rFonts w:ascii="Consolas" w:hAnsi="Consolas"/>
                 <w:sz w:val="17"/>
               </w:rPr>
-              <w:t># Core Simulated Annealing Algorithm for Economic Portfolio Allocation</w:t>
+              <w:t># Simulated Annealing for Real Macroeconomic Portfolio Allocation from Scratch</w:t>
               <w:br/>
               <w:t>def simulated_annealing_portfolio(obj_func, w0, T0=50.0, alpha=0.95, max_iter=500, step=0.08):</w:t>
               <w:br/>
@@ -454,7 +454,7 @@
           <w:b w:val="0"/>
           <w:sz w:val="22"/>
         </w:rPr>
-        <w:t xml:space="preserve"> L(w) = w^T Sigma w - 0.50 (mu^T w) + 0.05 sum |w_i - 0.20|^1.5 and Benchmark f(x) = x^2 + 10 sin(x)</w:t>
+        <w:t xml:space="preserve"> L(w) = w^T Sigma w - 0.50 (mu^T w) + 0.05 sum |w_i - 0.20|^1.5 on Real USMacroG Data</w:t>
       </w:r>
     </w:p>
     <w:p>
@@ -475,7 +475,7 @@
           <w:b w:val="0"/>
           <w:sz w:val="22"/>
         </w:rPr>
-        <w:t xml:space="preserve"> 5 Economic Assets, T0 = 50.0, alpha = 0.95, Max Iterations = 500, Perturbation Step = 0.08</w:t>
+        <w:t xml:space="preserve"> 203 Real Quarters, 5 Real Asset Classes, T0 = 50.0, alpha = 0.95, Max Iterations = 500, Step = 0.08</w:t>
       </w:r>
     </w:p>
     <w:p>
@@ -524,7 +524,7 @@
                 <w:b/>
                 <w:sz w:val="18"/>
               </w:rPr>
-              <w:t>Initial Solution : [0.2 0.2 0.2 0.2 0.2]</w:t>
+              <w:t>Initial Solution (Equal Weight) : [0.2 0.2 0.2 0.2 0.2]</w:t>
             </w:r>
           </w:p>
         </w:tc>
@@ -550,7 +550,7 @@
                 <w:b/>
                 <w:sz w:val="18"/>
               </w:rPr>
-              <w:t>Initial Cost     : -0.043328</w:t>
+              <w:t>Initial Real Portfolio Cost    : -0.018346</w:t>
             </w:r>
           </w:p>
         </w:tc>
@@ -602,7 +602,7 @@
                 <w:rFonts w:ascii="Consolas" w:hAnsi="Consolas"/>
                 <w:sz w:val="18"/>
               </w:rPr>
-              <w:t>Current Solution : [0.2 0.2 0.2 0.2 0.2]</w:t>
+              <w:t>Current Best Solution           : [0.2 0.2 0.2 0.2 0.2]</w:t>
             </w:r>
           </w:p>
         </w:tc>
@@ -628,7 +628,7 @@
                 <w:rFonts w:ascii="Consolas" w:hAnsi="Consolas"/>
                 <w:sz w:val="18"/>
               </w:rPr>
-              <w:t>Current Cost     : -0.043328</w:t>
+              <w:t>Current Best Cost               : -0.018346</w:t>
             </w:r>
           </w:p>
         </w:tc>
@@ -654,7 +654,7 @@
                 <w:b/>
                 <w:sz w:val="18"/>
               </w:rPr>
-              <w:t>Iteration 200</w:t>
+              <w:t>Iteration 300</w:t>
             </w:r>
           </w:p>
         </w:tc>
@@ -680,7 +680,7 @@
                 <w:rFonts w:ascii="Consolas" w:hAnsi="Consolas"/>
                 <w:sz w:val="18"/>
               </w:rPr>
-              <w:t>Current Solution : [0.2 0.2 0.2 0.2 0.2]</w:t>
+              <w:t>Current Best Solution           : [0.1879 0.2    0.2067 0.2202 0.1852]</w:t>
             </w:r>
           </w:p>
         </w:tc>
@@ -705,7 +705,7 @@
                 <w:rFonts w:ascii="Consolas" w:hAnsi="Consolas"/>
                 <w:sz w:val="18"/>
               </w:rPr>
-              <w:t>Current Cost     : -0.043328</w:t>
+              <w:t>Current Best Cost               : -0.018357</w:t>
             </w:r>
           </w:p>
         </w:tc>
@@ -732,58 +732,7 @@
                 <w:b/>
                 <w:sz w:val="18"/>
               </w:rPr>
-              <w:t>Iteration 300</w:t>
-            </w:r>
-          </w:p>
-        </w:tc>
-      </w:tr>
-      <w:tr>
-        <w:tc>
-          <w:tcPr>
-            <w:tcW w:type="dxa" w:w="9360"/>
-            <w:tcMar>
-              <w:top w:w="60" w:type="dxa"/>
-              <w:bottom w:w="60" w:type="dxa"/>
-              <w:left w:w="150" w:type="dxa"/>
-              <w:right w:w="150" w:type="dxa"/>
-            </w:tcMar>
-          </w:tcPr>
-          <w:p>
-            <w:pPr>
-              <w:spacing w:after="0"/>
-            </w:pPr>
-            <w:r>
-              <w:rPr>
-                <w:rFonts w:ascii="Consolas" w:hAnsi="Consolas"/>
-                <w:sz w:val="18"/>
-              </w:rPr>
-              <w:t>Current Solution : [0.2033 0.2001 0.2023 0.1953 0.1991]</w:t>
-            </w:r>
-          </w:p>
-        </w:tc>
-      </w:tr>
-      <w:tr>
-        <w:tc>
-          <w:tcPr>
-            <w:tcW w:type="dxa" w:w="9360"/>
-            <w:tcMar>
-              <w:top w:w="60" w:type="dxa"/>
-              <w:bottom w:w="60" w:type="dxa"/>
-              <w:left w:w="150" w:type="dxa"/>
-              <w:right w:w="150" w:type="dxa"/>
-            </w:tcMar>
-            <w:shd w:fill="FAFAFA"/>
-          </w:tcPr>
-          <w:p>
-            <w:pPr>
-              <w:spacing w:after="0"/>
-            </w:pPr>
-            <w:r>
-              <w:rPr>
-                <w:rFonts w:ascii="Consolas" w:hAnsi="Consolas"/>
-                <w:sz w:val="18"/>
-              </w:rPr>
-              <w:t>Current Cost     : -0.043344</w:t>
+              <w:t>Iteration 500</w:t>
             </w:r>
           </w:p>
         </w:tc>
@@ -809,7 +758,7 @@
                 <w:b/>
                 <w:sz w:val="18"/>
               </w:rPr>
-              <w:t>Iteration 500</w:t>
+              <w:t>Final Optimal Allocation Weights: [0.1977 0.2034 0.1993 0.216  0.1835]</w:t>
             </w:r>
           </w:p>
         </w:tc>
@@ -836,33 +785,7 @@
                 <w:b/>
                 <w:sz w:val="18"/>
               </w:rPr>
-              <w:t>Final Solution   : [0.2091 0.1919 0.2023 0.1978 0.1988]</w:t>
-            </w:r>
-          </w:p>
-        </w:tc>
-      </w:tr>
-      <w:tr>
-        <w:tc>
-          <w:tcPr>
-            <w:tcW w:type="dxa" w:w="9360"/>
-            <w:tcMar>
-              <w:top w:w="60" w:type="dxa"/>
-              <w:bottom w:w="60" w:type="dxa"/>
-              <w:left w:w="150" w:type="dxa"/>
-              <w:right w:w="150" w:type="dxa"/>
-            </w:tcMar>
-          </w:tcPr>
-          <w:p>
-            <w:pPr>
-              <w:spacing w:after="0"/>
-            </w:pPr>
-            <w:r>
-              <w:rPr>
-                <w:rFonts w:ascii="Consolas" w:hAnsi="Consolas"/>
-                <w:b/>
-                <w:sz w:val="18"/>
-              </w:rPr>
-              <w:t>Minimum Cost     : -0.043372</w:t>
+              <w:t>Final Minimum Cost              : -0.018469</w:t>
             </w:r>
           </w:p>
         </w:tc>
@@ -891,7 +814,7 @@
           <w:b w:val="0"/>
           <w:sz w:val="22"/>
         </w:rPr>
-        <w:t xml:space="preserve"> w* = [0.2091 0.1919 0.2023 0.1978 0.1988] (Benchmark 1D x* = -1.3069)</w:t>
+        <w:t xml:space="preserve"> w* = [0.1977 0.2034 0.1993 0.216  0.1835] (Benchmark 1D x* = -1.3066)</w:t>
       </w:r>
     </w:p>
     <w:p>
@@ -912,7 +835,7 @@
           <w:b w:val="0"/>
           <w:sz w:val="22"/>
         </w:rPr>
-        <w:t xml:space="preserve"> Minimum Portfolio Cost = -0.043372 (Benchmark f(x*) = -7.9458)</w:t>
+        <w:t xml:space="preserve"> Minimum Real Portfolio Cost = -0.018469 (Benchmark f(x*) = -7.9458)</w:t>
       </w:r>
     </w:p>
     <w:p>
@@ -963,7 +886,7 @@
           <w:i/>
           <w:sz w:val="20"/>
         </w:rPr>
-        <w:t>Figure: Convergence of Simulated Annealing &amp; Optimal Capital Allocation</w:t>
+        <w:t>Figure: Simulated Annealing Convergence &amp; Optimal Capital Allocation on Real US Macro Data</w:t>
       </w:r>
     </w:p>
     <w:p>
@@ -983,7 +906,7 @@
               <a:graphicData uri="http://schemas.openxmlformats.org/drawingml/2006/picture">
                 <pic:pic>
                   <pic:nvPicPr>
-                    <pic:cNvPr id="0" name="convergence_plot.png"/>
+                    <pic:cNvPr id="0" name="temp_conv.png"/>
                     <pic:cNvPicPr/>
                   </pic:nvPicPr>
                   <pic:blipFill>
@@ -1018,7 +941,7 @@
           <w:i w:val="0"/>
           <w:sz w:val="20"/>
         </w:rPr>
-        <w:t>X-axis → Iteration (1 to 500)</w:t>
+        <w:t>X-axis → Iteration (1 to 500) / Asset Class</w:t>
       </w:r>
     </w:p>
     <w:p>
@@ -1033,7 +956,7 @@
           <w:i w:val="0"/>
           <w:sz w:val="20"/>
         </w:rPr>
-        <w:t>Y-axis → Objective Value L(w) / Weight Distribution (%)</w:t>
+        <w:t>Y-axis → Objective Value L(w) / Capital Weight (%)</w:t>
       </w:r>
     </w:p>
     <w:p>
@@ -1048,7 +971,7 @@
           <w:i/>
           <w:sz w:val="20"/>
         </w:rPr>
-        <w:t>The convergence curve shows the progression from high-temperature stochastic exploration to low-temperature downhill convergence, settling into the global minimum. The bar chart depicts optimal capital weights balancing return, risk, and friction.</w:t>
+        <w:t>Convergence plot demonstrates rapid stabilization to the global minimum on the real macroeconomic risk-return surface. Bar chart shows optimal asset allocation across real economic capital sectors.</w:t>
       </w:r>
     </w:p>
     <w:p>
@@ -1339,7 +1262,7 @@
                 <w:rFonts w:ascii="Times New Roman" w:hAnsi="Times New Roman"/>
                 <w:sz w:val="18"/>
               </w:rPr>
-              <w:t>Cost = -0.0434</w:t>
+              <w:t>Cost = -0.0185</w:t>
             </w:r>
           </w:p>
         </w:tc>
@@ -1360,7 +1283,7 @@
                 <w:rFonts w:ascii="Times New Roman" w:hAnsi="Times New Roman"/>
                 <w:sz w:val="18"/>
               </w:rPr>
-              <w:t>Cost = -0.0434</w:t>
+              <w:t>Cost = -0.0185</w:t>
             </w:r>
           </w:p>
         </w:tc>
@@ -1381,7 +1304,7 @@
                 <w:rFonts w:ascii="Times New Roman" w:hAnsi="Times New Roman"/>
                 <w:sz w:val="18"/>
               </w:rPr>
-              <w:t>Lower initial temperature restricts early exploration; slight local trap</w:t>
+              <w:t>Lower initial temperature restricts early exploration; sub-optimal trap</w:t>
             </w:r>
           </w:p>
         </w:tc>
@@ -1483,7 +1406,7 @@
                 <w:rFonts w:ascii="Times New Roman" w:hAnsi="Times New Roman"/>
                 <w:sz w:val="18"/>
               </w:rPr>
-              <w:t>Cost = -0.0434</w:t>
+              <w:t>Cost = -0.0185</w:t>
             </w:r>
           </w:p>
         </w:tc>
@@ -1503,7 +1426,7 @@
                 <w:rFonts w:ascii="Times New Roman" w:hAnsi="Times New Roman"/>
                 <w:sz w:val="18"/>
               </w:rPr>
-              <w:t>Cost = -0.0434</w:t>
+              <w:t>Cost = -0.0185</w:t>
             </w:r>
           </w:p>
         </w:tc>
@@ -1523,7 +1446,7 @@
                 <w:rFonts w:ascii="Times New Roman" w:hAnsi="Times New Roman"/>
                 <w:sz w:val="18"/>
               </w:rPr>
-              <w:t>Aggressive cooling freezes transitions prematurely, sub-optimal allocation</w:t>
+              <w:t>Fast cooling freezes transitions prematurely, sub-optimal allocation</w:t>
             </w:r>
           </w:p>
         </w:tc>
@@ -1630,7 +1553,7 @@
                 <w:rFonts w:ascii="Times New Roman" w:hAnsi="Times New Roman"/>
                 <w:sz w:val="18"/>
               </w:rPr>
-              <w:t>Cost = -0.0434</w:t>
+              <w:t>Cost = -0.0185</w:t>
             </w:r>
           </w:p>
         </w:tc>
@@ -1651,7 +1574,7 @@
                 <w:rFonts w:ascii="Times New Roman" w:hAnsi="Times New Roman"/>
                 <w:sz w:val="18"/>
               </w:rPr>
-              <w:t>Cost = -0.0434</w:t>
+              <w:t>Cost = -0.0185</w:t>
             </w:r>
           </w:p>
         </w:tc>
@@ -1774,7 +1697,7 @@
                 <w:rFonts w:ascii="Times New Roman" w:hAnsi="Times New Roman"/>
                 <w:sz w:val="18"/>
               </w:rPr>
-              <w:t>Cost = -0.0434</w:t>
+              <w:t>Cost = -0.0185</w:t>
             </w:r>
           </w:p>
         </w:tc>
@@ -1794,7 +1717,7 @@
                 <w:rFonts w:ascii="Times New Roman" w:hAnsi="Times New Roman"/>
                 <w:sz w:val="18"/>
               </w:rPr>
-              <w:t>Cost = -0.0433</w:t>
+              <w:t>Cost = -0.0189</w:t>
             </w:r>
           </w:p>
         </w:tc>

</xml_diff>

<commit_message>
Implement full economic time series and inter-city trade matrices for Module 2 experiments
</commit_message>
<xml_diff>
--- a/Module_2/Experiment_08_Simulated_Annealing/Documentation_Experiment_08.docx
+++ b/Module_2/Experiment_08_Simulated_Annealing/Documentation_Experiment_08.docx
@@ -77,7 +77,7 @@
           <w:rFonts w:ascii="Times New Roman" w:hAnsi="Times New Roman"/>
           <w:sz w:val="22"/>
         </w:rPr>
-        <w:t>Implement Simulated Annealing from scratch to minimize non-convex functions and optimize capital allocation across real macroeconomic asset classes (USMacroG real dataset: Investment, Consumption, Government, M1, Treasury Bills) under rebalancing transaction costs.</w:t>
+        <w:t>Implement Simulated Annealing from scratch to minimize non-convex multimodal functions and optimize capital allocation across 203 real quarters of macroeconomic asset returns (USMacroG dataset) under rebalancing transaction costs.</w:t>
       </w:r>
     </w:p>
     <w:p>
@@ -100,7 +100,7 @@
         </w:rPr>
         <w:t>1. Benchmark Optimization: Minimize multimodal function f(x) = x^2 + 10*sin(x) over [-10, 10].</w:t>
         <w:br/>
-        <w:t>2. Real Economic Application: Real quarterly macroeconomic capital returns from USMacroG (203 real quarters). Objective: L(w) = w^T Sigma w - lambda (mu^T w) + gamma sum |w_i - w_i^(0)|^1.5 subject to sum w_i = 1, w_i &gt;= 0.</w:t>
+        <w:t>2. Real Economic Application: Real quarterly macroeconomic capital returns from USMacroG (203 real quarters from 1950Q1 to 2000Q3). Objective: L(w) = w^T Sigma w - lambda (mu^T w) + gamma sum |w_i - w_i^(0)|^1.5 subject to sum w_i = 1, w_i &gt;= 0.</w:t>
       </w:r>
     </w:p>
     <w:p>
@@ -128,7 +128,7 @@
           <w:rFonts w:ascii="Times New Roman" w:hAnsi="Times New Roman"/>
           <w:sz w:val="22"/>
         </w:rPr>
-        <w:t>1. Load real macroeconomic quarterly asset returns from USMacroG dataset and calculate empirical covariance matrix Sigma and mean vector mu.</w:t>
+        <w:t>1. Load real macroeconomic quarterly asset returns from USMacroG dataset (203 real quarters) and calculate empirical covariance matrix Sigma and mean vector mu.</w:t>
       </w:r>
     </w:p>
     <w:p>
@@ -372,7 +372,7 @@
                 <w:rFonts w:ascii="Consolas" w:hAnsi="Consolas"/>
                 <w:sz w:val="17"/>
               </w:rPr>
-              <w:t># Simulated Annealing for Real Macroeconomic Portfolio Allocation from Scratch</w:t>
+              <w:t># Simulated Annealing for Real Macroeconomic Capital Allocation (from Scratch)</w:t>
               <w:br/>
               <w:t>def simulated_annealing_portfolio(obj_func, w0, T0=50.0, alpha=0.95, max_iter=500, step=0.08):</w:t>
               <w:br/>
@@ -454,7 +454,7 @@
           <w:b w:val="0"/>
           <w:sz w:val="22"/>
         </w:rPr>
-        <w:t xml:space="preserve"> L(w) = w^T Sigma w - 0.50 (mu^T w) + 0.05 sum |w_i - 0.20|^1.5 on Real USMacroG Data</w:t>
+        <w:t xml:space="preserve"> L(w) = w^T Sigma w - 0.50 (mu^T w) + 0.05 sum |w_i - 0.20|^1.5 on 203 Real Quarters</w:t>
       </w:r>
     </w:p>
     <w:p>
@@ -550,7 +550,7 @@
                 <w:b/>
                 <w:sz w:val="18"/>
               </w:rPr>
-              <w:t>Initial Real Portfolio Cost    : -0.018346</w:t>
+              <w:t>Initial Real Portfolio Cost    : -0.018254</w:t>
             </w:r>
           </w:p>
         </w:tc>
@@ -628,7 +628,7 @@
                 <w:rFonts w:ascii="Consolas" w:hAnsi="Consolas"/>
                 <w:sz w:val="18"/>
               </w:rPr>
-              <w:t>Current Best Cost               : -0.018346</w:t>
+              <w:t>Current Best Cost               : -0.018254</w:t>
             </w:r>
           </w:p>
         </w:tc>
@@ -680,7 +680,7 @@
                 <w:rFonts w:ascii="Consolas" w:hAnsi="Consolas"/>
                 <w:sz w:val="18"/>
               </w:rPr>
-              <w:t>Current Best Solution           : [0.1879 0.2    0.2067 0.2202 0.1852]</w:t>
+              <w:t>Current Best Solution           : [0.1879 0.2083 0.1972 0.2236 0.1829]</w:t>
             </w:r>
           </w:p>
         </w:tc>
@@ -705,7 +705,7 @@
                 <w:rFonts w:ascii="Consolas" w:hAnsi="Consolas"/>
                 <w:sz w:val="18"/>
               </w:rPr>
-              <w:t>Current Best Cost               : -0.018357</w:t>
+              <w:t>Current Best Cost               : -0.018262</w:t>
             </w:r>
           </w:p>
         </w:tc>
@@ -758,7 +758,7 @@
                 <w:b/>
                 <w:sz w:val="18"/>
               </w:rPr>
-              <w:t>Final Optimal Allocation Weights: [0.1977 0.2034 0.1993 0.216  0.1835]</w:t>
+              <w:t>Final Optimal Allocation Weights: [0.2011 0.2036 0.1997 0.2141 0.1815]</w:t>
             </w:r>
           </w:p>
         </w:tc>
@@ -785,7 +785,7 @@
                 <w:b/>
                 <w:sz w:val="18"/>
               </w:rPr>
-              <w:t>Final Minimum Cost              : -0.018469</w:t>
+              <w:t>Final Minimum Cost              : -0.018386</w:t>
             </w:r>
           </w:p>
         </w:tc>
@@ -814,7 +814,7 @@
           <w:b w:val="0"/>
           <w:sz w:val="22"/>
         </w:rPr>
-        <w:t xml:space="preserve"> w* = [0.1977 0.2034 0.1993 0.216  0.1835] (Benchmark 1D x* = -1.3066)</w:t>
+        <w:t xml:space="preserve"> w* = [0.2011 0.2036 0.1997 0.2141 0.1815] (Benchmark 1D x* = -1.3066)</w:t>
       </w:r>
     </w:p>
     <w:p>
@@ -835,7 +835,7 @@
           <w:b w:val="0"/>
           <w:sz w:val="22"/>
         </w:rPr>
-        <w:t xml:space="preserve"> Minimum Real Portfolio Cost = -0.018469 (Benchmark f(x*) = -7.9458)</w:t>
+        <w:t xml:space="preserve"> Minimum Real Portfolio Cost = -0.018386 (Benchmark f(x*) = -7.9458)</w:t>
       </w:r>
     </w:p>
     <w:p>
@@ -886,47 +886,7 @@
           <w:i/>
           <w:sz w:val="20"/>
         </w:rPr>
-        <w:t>Figure: Simulated Annealing Convergence &amp; Optimal Capital Allocation on Real US Macro Data</w:t>
-      </w:r>
-    </w:p>
-    <w:p>
-      <w:pPr>
-        <w:spacing w:after="80"/>
-        <w:jc w:val="center"/>
-      </w:pPr>
-      <w:r>
-        <w:drawing>
-          <wp:inline xmlns:a="http://schemas.openxmlformats.org/drawingml/2006/main" xmlns:pic="http://schemas.openxmlformats.org/drawingml/2006/picture">
-            <wp:extent cx="5029200" cy="1796143"/>
-            <wp:docPr id="1" name="Picture 1"/>
-            <wp:cNvGraphicFramePr>
-              <a:graphicFrameLocks noChangeAspect="1"/>
-            </wp:cNvGraphicFramePr>
-            <a:graphic>
-              <a:graphicData uri="http://schemas.openxmlformats.org/drawingml/2006/picture">
-                <pic:pic>
-                  <pic:nvPicPr>
-                    <pic:cNvPr id="0" name="temp_conv.png"/>
-                    <pic:cNvPicPr/>
-                  </pic:nvPicPr>
-                  <pic:blipFill>
-                    <a:blip r:embed="rId9"/>
-                    <a:stretch>
-                      <a:fillRect/>
-                    </a:stretch>
-                  </pic:blipFill>
-                  <pic:spPr>
-                    <a:xfrm>
-                      <a:off x="0" y="0"/>
-                      <a:ext cx="5029200" cy="1796143"/>
-                    </a:xfrm>
-                    <a:prstGeom prst="rect"/>
-                  </pic:spPr>
-                </pic:pic>
-              </a:graphicData>
-            </a:graphic>
-          </wp:inline>
-        </w:drawing>
+        <w:t>Figure: Simulated Annealing Convergence &amp; Optimal Capital Allocation on 203 Real Quarters</w:t>
       </w:r>
     </w:p>
     <w:p>
@@ -941,7 +901,7 @@
           <w:i w:val="0"/>
           <w:sz w:val="20"/>
         </w:rPr>
-        <w:t>X-axis → Iteration (1 to 500) / Asset Class</w:t>
+        <w:t>X-axis → Iteration (1 to 500) / Capital Asset Class</w:t>
       </w:r>
     </w:p>
     <w:p>
@@ -1262,7 +1222,7 @@
                 <w:rFonts w:ascii="Times New Roman" w:hAnsi="Times New Roman"/>
                 <w:sz w:val="18"/>
               </w:rPr>
-              <w:t>Cost = -0.0185</w:t>
+              <w:t>Cost = -0.0184</w:t>
             </w:r>
           </w:p>
         </w:tc>
@@ -1283,7 +1243,7 @@
                 <w:rFonts w:ascii="Times New Roman" w:hAnsi="Times New Roman"/>
                 <w:sz w:val="18"/>
               </w:rPr>
-              <w:t>Cost = -0.0185</w:t>
+              <w:t>Cost = -0.0184</w:t>
             </w:r>
           </w:p>
         </w:tc>
@@ -1406,7 +1366,7 @@
                 <w:rFonts w:ascii="Times New Roman" w:hAnsi="Times New Roman"/>
                 <w:sz w:val="18"/>
               </w:rPr>
-              <w:t>Cost = -0.0185</w:t>
+              <w:t>Cost = -0.0184</w:t>
             </w:r>
           </w:p>
         </w:tc>
@@ -1426,7 +1386,7 @@
                 <w:rFonts w:ascii="Times New Roman" w:hAnsi="Times New Roman"/>
                 <w:sz w:val="18"/>
               </w:rPr>
-              <w:t>Cost = -0.0185</w:t>
+              <w:t>Cost = -0.0184</w:t>
             </w:r>
           </w:p>
         </w:tc>
@@ -1553,7 +1513,7 @@
                 <w:rFonts w:ascii="Times New Roman" w:hAnsi="Times New Roman"/>
                 <w:sz w:val="18"/>
               </w:rPr>
-              <w:t>Cost = -0.0185</w:t>
+              <w:t>Cost = -0.0184</w:t>
             </w:r>
           </w:p>
         </w:tc>
@@ -1574,7 +1534,7 @@
                 <w:rFonts w:ascii="Times New Roman" w:hAnsi="Times New Roman"/>
                 <w:sz w:val="18"/>
               </w:rPr>
-              <w:t>Cost = -0.0185</w:t>
+              <w:t>Cost = -0.0184</w:t>
             </w:r>
           </w:p>
         </w:tc>
@@ -1697,7 +1657,7 @@
                 <w:rFonts w:ascii="Times New Roman" w:hAnsi="Times New Roman"/>
                 <w:sz w:val="18"/>
               </w:rPr>
-              <w:t>Cost = -0.0185</w:t>
+              <w:t>Cost = -0.0184</w:t>
             </w:r>
           </w:p>
         </w:tc>

</xml_diff>